<commit_message>
fix: corrigir justificativa APAC, EXEMPLO receita especial e CPF
- apac.py: mover replace de JUSTIFICATIVA DA SOLICITACAO ANTES do
  replace de SOLICITACAO para evitar que o procedimento destrua o
  placeholder da justificativa
- receita_especial.py: substituir conteudo SDT diretamente no XML
  pois LibreOffice nao atualiza cached SDT content a partir de
  document properties
- TEMPLATE_APAC_ISOLADO.docx: CPF com 4 espacos uniformes (51 chars)

Co-Authored-By: Claude Opus 4.6 <noreply@anthropic.com>
</commit_message>
<xml_diff>
--- a/app/templates/TEMPLATE_APAC_ISOLADO.docx
+++ b/app/templates/TEMPLATE_APAC_ISOLADO.docx
@@ -806,7 +806,7 @@
                         <w:txbxContent>
                           <w:p>
                             <w:r>
-                              <w:t>1     0     7     6     7     0     8     0     4     8     3</w:t>
+                              <w:t>1    0    7    6    7    0    8    0    4    8    3</w:t>
                             </w:r>
                           </w:p>
                         </w:txbxContent>
@@ -833,7 +833,7 @@
                   <w:txbxContent>
                     <w:p>
                       <w:r>
-                        <w:t>1     0     7     6     7     0     8     0     4     8     3</w:t>
+                        <w:t>1    0    7    6    7    0    8    0    4    8    3</w:t>
                       </w:r>
                     </w:p>
                   </w:txbxContent>

</xml_diff>

<commit_message>
fix: corrigir [REGIAO] na justificativa e CPF truncado
- gerar.py: sanitizar justificativa substituindo [REGIAO] pela regiao
  real antes de enviar ao gerador de APAC
- TEMPLATE_APAC_ISOLADO.docx: reduzir espacamento CPF de 4 para 3
  espacos (51->41 chars) para caber todos 11 digitos no textbox

Co-Authored-By: Claude Opus 4.6 <noreply@anthropic.com>
</commit_message>
<xml_diff>
--- a/app/templates/TEMPLATE_APAC_ISOLADO.docx
+++ b/app/templates/TEMPLATE_APAC_ISOLADO.docx
@@ -806,7 +806,7 @@
                         <w:txbxContent>
                           <w:p>
                             <w:r>
-                              <w:t>1    0    7    6    7    0    8    0    4    8    3</w:t>
+                              <w:t>1   0   7   6   7   0   8   0   4   8   3</w:t>
                             </w:r>
                           </w:p>
                         </w:txbxContent>
@@ -833,7 +833,7 @@
                   <w:txbxContent>
                     <w:p>
                       <w:r>
-                        <w:t>1    0    7    6    7    0    8    0    4    8    3</w:t>
+                        <w:t>1   0   7   6   7   0   8   0   4   8   3</w:t>
                       </w:r>
                     </w:p>
                   </w:txbxContent>

</xml_diff>

<commit_message>
fix: CPF com Courier New, simplificar formulário, outro med especial
- Template APAC: CPF usa Courier New 10.5pt com 2 espaços para
  alinhamento preciso nos quadradinhos
- Formulário: remover Diagnóstico 2 e Membro Afetado (campos não
  utilizados nos documentos gerados)
- Receita Especial: adicionar opção "Outro Medicamento" para
  medicamentos não pré-cadastrados
- Backend: limpar campos removidos do gerar.py

Co-Authored-By: Claude Opus 4.6 <noreply@anthropic.com>
</commit_message>
<xml_diff>
--- a/app/templates/TEMPLATE_APAC_ISOLADO.docx
+++ b/app/templates/TEMPLATE_APAC_ISOLADO.docx
@@ -806,12 +806,17 @@
                         <w:txbxContent>
                           <w:p>
                             <w:r>
-                              <w:t>1   0   7   6   7   0   8   0   4   8   3</w:t>
+                              <w:rPr>
+                                <w:rFonts w:ascii="Courier New" w:hAnsi="Courier New" w:cs="Courier New"/>
+                                <w:sz w:val="21"/>
+                                <w:szCs w:val="21"/>
+                              </w:rPr>
+                              <w:t xml:space="preserve">1  0  7  6  7  0  8  0  4  8  3</w:t>
                             </w:r>
                           </w:p>
                         </w:txbxContent>
                       </wps:txbx>
-                      <wps:bodyPr rot="0" spcFirstLastPara="0" vertOverflow="overflow" horzOverflow="overflow" vert="horz" wrap="square" lIns="91440" tIns="45720" rIns="91440" bIns="45720" numCol="1" spcCol="0" rtlCol="0" fromWordArt="0" anchor="t" anchorCtr="0" forceAA="0" compatLnSpc="1">
+                      <wps:bodyPr rot="0" spcFirstLastPara="0" vertOverflow="overflow" horzOverflow="overflow" vert="horz" wrap="square" lIns="80900" tIns="45720" rIns="91440" bIns="45720" numCol="1" spcCol="0" rtlCol="0" fromWordArt="0" anchor="t" anchorCtr="0" forceAA="0" compatLnSpc="1">
                         <a:prstTxWarp prst="textNoShape">
                           <a:avLst/>
                         </a:prstTxWarp>
@@ -833,7 +838,12 @@
                   <w:txbxContent>
                     <w:p>
                       <w:r>
-                        <w:t>1   0   7   6   7   0   8   0   4   8   3</w:t>
+                        <w:rPr>
+                          <w:rFonts w:ascii="Courier New" w:hAnsi="Courier New" w:cs="Courier New"/>
+                          <w:sz w:val="21"/>
+                          <w:szCs w:val="21"/>
+                        </w:rPr>
+                        <w:t xml:space="preserve">1  0  7  6  7  0  8  0  4  8  3</w:t>
                       </w:r>
                     </w:p>
                   </w:txbxContent>

</xml_diff>

<commit_message>
fix: remover obs clínica, ajustar CPF, inverter data/assinatura
- Formulário: remover campo "Observação Clínica" (não usado)
- CPF: ajustar espaçamento individual dos dígitos conforme feedback
  visual (Liberation Mono 10pt com espaçamento customizado)
- Atestado: mover "Palmares-PE, data" para ABAIXO do nome/CRM
- Laudo: idem, cidade+data abaixo da assinatura

Co-Authored-By: Claude Opus 4.6 <noreply@anthropic.com>
</commit_message>
<xml_diff>
--- a/app/templates/TEMPLATE_APAC_ISOLADO.docx
+++ b/app/templates/TEMPLATE_APAC_ISOLADO.docx
@@ -807,11 +807,11 @@
                           <w:p>
                             <w:r>
                               <w:rPr>
-                                <w:rFonts w:ascii="Courier New" w:hAnsi="Courier New" w:cs="Courier New"/>
-                                <w:sz w:val="21"/>
-                                <w:szCs w:val="21"/>
+                                <w:rFonts w:ascii="Liberation Mono" w:hAnsi="Liberation Mono" w:cs="Liberation Mono"/>
+                                <w:sz w:val="20"/>
+                                <w:szCs w:val="20"/>
                               </w:rPr>
-                              <w:t xml:space="preserve">1  0  7  6  7  0  8  0  4  8  3</w:t>
+                              <w:t xml:space="preserve">1   0    7  6   7  0  8  0  4  8  3</w:t>
                             </w:r>
                           </w:p>
                         </w:txbxContent>
@@ -834,16 +834,16 @@
           <mc:Fallback>
             <w:pict>
               <v:shape w14:anchorId="26B42CC1" id="_x0000_s1033" type="#_x0000_t202" style="position:absolute;left:0;text-align:left;margin-left:72.3pt;margin-top:584.7pt;width:209.4pt;height:23.4pt;z-index:251012096;visibility:visible;mso-wrap-style:square;mso-width-percent:0;mso-wrap-distance-left:9pt;mso-wrap-distance-top:0;mso-wrap-distance-right:9pt;mso-wrap-distance-bottom:0;mso-position-horizontal:absolute;mso-position-horizontal-relative:text;mso-position-vertical:absolute;mso-position-vertical-relative:text;mso-width-percent:0;mso-width-relative:margin;v-text-anchor:top" o:gfxdata="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" filled="f" stroked="f" strokeweight=".5pt">
-                <v:textbox>
+                <v:textbox inset=".089in,.05in,.1in,.05in">
                   <w:txbxContent>
                     <w:p>
                       <w:r>
                         <w:rPr>
-                          <w:rFonts w:ascii="Courier New" w:hAnsi="Courier New" w:cs="Courier New"/>
-                          <w:sz w:val="21"/>
-                          <w:szCs w:val="21"/>
+                          <w:rFonts w:ascii="Liberation Mono" w:hAnsi="Liberation Mono" w:cs="Liberation Mono"/>
+                          <w:sz w:val="20"/>
+                          <w:szCs w:val="20"/>
                         </w:rPr>
-                        <w:t xml:space="preserve">1  0  7  6  7  0  8  0  4  8  3</w:t>
+                        <w:t xml:space="preserve">1   0    7  6   7  0  8  0  4  8  3</w:t>
                       </w:r>
                     </w:p>
                   </w:txbxContent>

</xml_diff>

<commit_message>
fix: CPF com character spacing uniforme e deslocamento vertical
- Usar w:spacing val=249 nos 11 dígitos sem espaços (mais preciso)
- Liberation Mono 11pt com espaçamento expandido de 249 twips
- Deslocar dígitos para baixo (tIns 45720→68000, VML top .05→.075in)
- lIns ajustado para centralizar primeiro dígito no box

Co-Authored-By: Claude Opus 4.6 <noreply@anthropic.com>
</commit_message>
<xml_diff>
--- a/app/templates/TEMPLATE_APAC_ISOLADO.docx
+++ b/app/templates/TEMPLATE_APAC_ISOLADO.docx
@@ -808,15 +808,16 @@
                             <w:r>
                               <w:rPr>
                                 <w:rFonts w:ascii="Liberation Mono" w:hAnsi="Liberation Mono" w:cs="Liberation Mono"/>
-                                <w:sz w:val="20"/>
-                                <w:szCs w:val="20"/>
+                                <w:sz w:val="22"/>
+                                <w:szCs w:val="22"/>
+                                <w:spacing w:val="249"/>
                               </w:rPr>
-                              <w:t xml:space="preserve">1   0    7  6   7  0  8  0  4  8  3</w:t>
+                              <w:t>10767080483</w:t>
                             </w:r>
                           </w:p>
                         </w:txbxContent>
                       </wps:txbx>
-                      <wps:bodyPr rot="0" spcFirstLastPara="0" vertOverflow="overflow" horzOverflow="overflow" vert="horz" wrap="square" lIns="80900" tIns="45720" rIns="91440" bIns="45720" numCol="1" spcCol="0" rtlCol="0" fromWordArt="0" anchor="t" anchorCtr="0" forceAA="0" compatLnSpc="1">
+                      <wps:bodyPr rot="0" spcFirstLastPara="0" vertOverflow="overflow" horzOverflow="overflow" vert="horz" wrap="square" lIns="79000" tIns="68000" rIns="91440" bIns="45720" numCol="1" spcCol="0" rtlCol="0" fromWordArt="0" anchor="t" anchorCtr="0" forceAA="0" compatLnSpc="1">
                         <a:prstTxWarp prst="textNoShape">
                           <a:avLst/>
                         </a:prstTxWarp>
@@ -834,16 +835,17 @@
           <mc:Fallback>
             <w:pict>
               <v:shape w14:anchorId="26B42CC1" id="_x0000_s1033" type="#_x0000_t202" style="position:absolute;left:0;text-align:left;margin-left:72.3pt;margin-top:584.7pt;width:209.4pt;height:23.4pt;z-index:251012096;visibility:visible;mso-wrap-style:square;mso-width-percent:0;mso-wrap-distance-left:9pt;mso-wrap-distance-top:0;mso-wrap-distance-right:9pt;mso-wrap-distance-bottom:0;mso-position-horizontal:absolute;mso-position-horizontal-relative:text;mso-position-vertical:absolute;mso-position-vertical-relative:text;mso-width-percent:0;mso-width-relative:margin;v-text-anchor:top" o:gfxdata="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" filled="f" stroked="f" strokeweight=".5pt">
-                <v:textbox inset=".089in,.05in,.1in,.05in">
+                <v:textbox inset=".086in,.075in,.1in,.05in">
                   <w:txbxContent>
                     <w:p>
                       <w:r>
                         <w:rPr>
                           <w:rFonts w:ascii="Liberation Mono" w:hAnsi="Liberation Mono" w:cs="Liberation Mono"/>
-                          <w:sz w:val="20"/>
-                          <w:szCs w:val="20"/>
+                          <w:sz w:val="22"/>
+                          <w:szCs w:val="22"/>
+                          <w:spacing w:val="249"/>
                         </w:rPr>
-                        <w:t xml:space="preserve">1   0    7  6   7  0  8  0  4  8  3</w:t>
+                        <w:t>10767080483</w:t>
                       </w:r>
                     </w:p>
                   </w:txbxContent>

</xml_diff>

<commit_message>
fix: CPF com Calibri 11pt e espaçamento variável exato do Word
Usa a mesma formatação que o usuário confirmou funcionar no Word:
Calibri 11pt com espaços variáveis entre dígitos (4-5 espaços).

Co-Authored-By: Claude Opus 4.6 <noreply@anthropic.com>
</commit_message>
<xml_diff>
--- a/app/templates/TEMPLATE_APAC_ISOLADO.docx
+++ b/app/templates/TEMPLATE_APAC_ISOLADO.docx
@@ -807,12 +807,11 @@
                           <w:p>
                             <w:r>
                               <w:rPr>
-                                <w:rFonts w:ascii="Liberation Mono" w:hAnsi="Liberation Mono" w:cs="Liberation Mono"/>
+                                <w:rFonts w:ascii="Calibri" w:hAnsi="Calibri" w:cs="Calibri"/>
                                 <w:sz w:val="22"/>
                                 <w:szCs w:val="22"/>
-                                <w:spacing w:val="249"/>
                               </w:rPr>
-                              <w:t>10767080483</w:t>
+                              <w:t xml:space="preserve">1    0     7    6    7    0    8    0   4     8    3</w:t>
                             </w:r>
                           </w:p>
                         </w:txbxContent>
@@ -840,12 +839,11 @@
                     <w:p>
                       <w:r>
                         <w:rPr>
-                          <w:rFonts w:ascii="Liberation Mono" w:hAnsi="Liberation Mono" w:cs="Liberation Mono"/>
+                          <w:rFonts w:ascii="Calibri" w:hAnsi="Calibri" w:cs="Calibri"/>
                           <w:sz w:val="22"/>
                           <w:szCs w:val="22"/>
-                          <w:spacing w:val="249"/>
                         </w:rPr>
-                        <w:t>10767080483</w:t>
+                        <w:t xml:space="preserve">1    0     7    6    7    0    8    0   4     8    3</w:t>
                       </w:r>
                     </w:p>
                   </w:txbxContent>

</xml_diff>

<commit_message>
fix: ajustar espaçamento CPF - reduzir gap antes do 1º 7 e entre 2º 7→0
- 0→primeiro 7: 5 espaços → 4 (7 estava pulando uma casa)
- segundo 7→0: 4 espaços → 3 (gap excessivo)

Co-Authored-By: Claude Opus 4.6 <noreply@anthropic.com>
</commit_message>
<xml_diff>
--- a/app/templates/TEMPLATE_APAC_ISOLADO.docx
+++ b/app/templates/TEMPLATE_APAC_ISOLADO.docx
@@ -811,7 +811,7 @@
                                 <w:sz w:val="22"/>
                                 <w:szCs w:val="22"/>
                               </w:rPr>
-                              <w:t xml:space="preserve">1    0     7    6    7    0    8    0   4     8    3</w:t>
+                              <w:t xml:space="preserve">1    0    7    6    7   0    8    0   4     8    3</w:t>
                             </w:r>
                           </w:p>
                         </w:txbxContent>
@@ -843,7 +843,7 @@
                           <w:sz w:val="22"/>
                           <w:szCs w:val="22"/>
                         </w:rPr>
-                        <w:t xml:space="preserve">1    0     7    6    7    0    8    0   4     8    3</w:t>
+                        <w:t xml:space="preserve">1    0    7    6    7   0    8    0   4     8    3</w:t>
                       </w:r>
                     </w:p>
                   </w:txbxContent>

</xml_diff>

<commit_message>
fix: CPF com 3 espaços uniformes entre todos os dígitos
Co-Authored-By: Claude Opus 4.6 <noreply@anthropic.com>
</commit_message>
<xml_diff>
--- a/app/templates/TEMPLATE_APAC_ISOLADO.docx
+++ b/app/templates/TEMPLATE_APAC_ISOLADO.docx
@@ -811,7 +811,7 @@
                                 <w:sz w:val="22"/>
                                 <w:szCs w:val="22"/>
                               </w:rPr>
-                              <w:t xml:space="preserve">1    0    7    6    7   0    8    0   4     8    3</w:t>
+                              <w:t xml:space="preserve">1   0   7   6   7   0   8   0   4   8   3</w:t>
                             </w:r>
                           </w:p>
                         </w:txbxContent>
@@ -843,7 +843,7 @@
                           <w:sz w:val="22"/>
                           <w:szCs w:val="22"/>
                         </w:rPr>
-                        <w:t xml:space="preserve">1    0    7    6    7   0    8    0   4     8    3</w:t>
+                        <w:t xml:space="preserve">1   0   7   6   7   0   8   0   4   8   3</w:t>
                       </w:r>
                     </w:p>
                   </w:txbxContent>

</xml_diff>

<commit_message>
fix: CPF 1+3sp, demais dígitos+2sp
Co-Authored-By: Claude Opus 4.6 <noreply@anthropic.com>
</commit_message>
<xml_diff>
--- a/app/templates/TEMPLATE_APAC_ISOLADO.docx
+++ b/app/templates/TEMPLATE_APAC_ISOLADO.docx
@@ -811,7 +811,7 @@
                                 <w:sz w:val="22"/>
                                 <w:szCs w:val="22"/>
                               </w:rPr>
-                              <w:t xml:space="preserve">1   0   7   6   7   0   8   0   4   8   3</w:t>
+                              <w:t xml:space="preserve">1   0  7  6  7  0  8  0  4  8  3</w:t>
                             </w:r>
                           </w:p>
                         </w:txbxContent>
@@ -843,7 +843,7 @@
                           <w:sz w:val="22"/>
                           <w:szCs w:val="22"/>
                         </w:rPr>
-                        <w:t xml:space="preserve">1   0   7   6   7   0   8   0   4   8   3</w:t>
+                        <w:t xml:space="preserve">1   0  7  6  7  0  8  0  4  8  3</w:t>
                       </w:r>
                     </w:p>
                   </w:txbxContent>

</xml_diff>

<commit_message>
fix: CPF 1+3sp, primeiro 7+3sp, demais+2sp
Co-Authored-By: Claude Opus 4.6 <noreply@anthropic.com>
</commit_message>
<xml_diff>
--- a/app/templates/TEMPLATE_APAC_ISOLADO.docx
+++ b/app/templates/TEMPLATE_APAC_ISOLADO.docx
@@ -811,7 +811,7 @@
                                 <w:sz w:val="22"/>
                                 <w:szCs w:val="22"/>
                               </w:rPr>
-                              <w:t xml:space="preserve">1   0  7  6  7  0  8  0  4  8  3</w:t>
+                              <w:t xml:space="preserve">1   0  7   6  7  0  8  0  4  8  3</w:t>
                             </w:r>
                           </w:p>
                         </w:txbxContent>
@@ -843,7 +843,7 @@
                           <w:sz w:val="22"/>
                           <w:szCs w:val="22"/>
                         </w:rPr>
-                        <w:t xml:space="preserve">1   0  7  6  7  0  8  0  4  8  3</w:t>
+                        <w:t xml:space="preserve">1   0  7   6  7  0  8  0  4  8  3</w:t>
                       </w:r>
                     </w:p>
                   </w:txbxContent>

</xml_diff>

<commit_message>
fix: CPF ajuste fino - segundo 7+3sp, 0(pos6)+3sp
Co-Authored-By: Claude Opus 4.6 <noreply@anthropic.com>
</commit_message>
<xml_diff>
--- a/app/templates/TEMPLATE_APAC_ISOLADO.docx
+++ b/app/templates/TEMPLATE_APAC_ISOLADO.docx
@@ -811,7 +811,7 @@
                                 <w:sz w:val="22"/>
                                 <w:szCs w:val="22"/>
                               </w:rPr>
-                              <w:t xml:space="preserve">1   0  7   6  7  0  8  0  4  8  3</w:t>
+                              <w:t xml:space="preserve">1   0  7   6  7   0   8  0  4  8  3</w:t>
                             </w:r>
                           </w:p>
                         </w:txbxContent>
@@ -843,7 +843,7 @@
                           <w:sz w:val="22"/>
                           <w:szCs w:val="22"/>
                         </w:rPr>
-                        <w:t xml:space="preserve">1   0  7   6  7  0  8  0  4  8  3</w:t>
+                        <w:t xml:space="preserve">1   0  7   6  7   0   8  0  4  8  3</w:t>
                       </w:r>
                     </w:p>
                   </w:txbxContent>

</xml_diff>

<commit_message>
fix: CPF ajuste - 4+3sp
Co-Authored-By: Claude Opus 4.6 <noreply@anthropic.com>
</commit_message>
<xml_diff>
--- a/app/templates/TEMPLATE_APAC_ISOLADO.docx
+++ b/app/templates/TEMPLATE_APAC_ISOLADO.docx
@@ -811,7 +811,7 @@
                                 <w:sz w:val="22"/>
                                 <w:szCs w:val="22"/>
                               </w:rPr>
-                              <w:t xml:space="preserve">1   0  7   6  7   0   8  0  4  8  3</w:t>
+                              <w:t xml:space="preserve">1   0  7   6  7   0   8  0  4   8  3</w:t>
                             </w:r>
                           </w:p>
                         </w:txbxContent>
@@ -843,7 +843,7 @@
                           <w:sz w:val="22"/>
                           <w:szCs w:val="22"/>
                         </w:rPr>
-                        <w:t xml:space="preserve">1   0  7   6  7   0   8  0  4  8  3</w:t>
+                        <w:t xml:space="preserve">1   0  7   6  7   0   8  0  4   8  3</w:t>
                       </w:r>
                     </w:p>
                   </w:txbxContent>

</xml_diff>

<commit_message>
fix: reduzir 1pt na data e diagnóstico da APAC
- Data: sz=28 (14pt) → sz=26 (13pt)
- Diagnóstico: adicionar sz=26 (13pt) explícito

Co-Authored-By: Claude Opus 4.6 <noreply@anthropic.com>
</commit_message>
<xml_diff>
--- a/app/templates/TEMPLATE_APAC_ISOLADO.docx
+++ b/app/templates/TEMPLATE_APAC_ISOLADO.docx
@@ -647,43 +647,43 @@
                           <w:p>
                             <w:pPr>
                               <w:rPr>
-                                <w:sz w:val="28"/>
-                                <w:szCs w:val="32"/>
+                                <w:sz w:val="26"/>
+                                <w:szCs w:val="30"/>
                               </w:rPr>
                             </w:pPr>
                             <w:r>
                               <w:rPr>
-                                <w:sz w:val="28"/>
-                                <w:szCs w:val="32"/>
+                                <w:sz w:val="26"/>
+                                <w:szCs w:val="30"/>
                               </w:rPr>
                               <w:fldChar w:fldCharType="begin"/>
                             </w:r>
                             <w:r>
                               <w:rPr>
-                                <w:sz w:val="28"/>
-                                <w:szCs w:val="32"/>
+                                <w:sz w:val="26"/>
+                                <w:szCs w:val="30"/>
                               </w:rPr>
                               <w:instrText xml:space="preserve"> DATE   \* MERGEFORMAT </w:instrText>
                             </w:r>
                             <w:r>
                               <w:rPr>
-                                <w:sz w:val="28"/>
-                                <w:szCs w:val="32"/>
+                                <w:sz w:val="26"/>
+                                <w:szCs w:val="30"/>
                               </w:rPr>
                               <w:fldChar w:fldCharType="separate"/>
                             </w:r>
                             <w:r>
                               <w:rPr>
                                 <w:noProof/>
-                                <w:sz w:val="28"/>
-                                <w:szCs w:val="32"/>
+                                <w:sz w:val="26"/>
+                                <w:szCs w:val="30"/>
                               </w:rPr>
                               <w:t>18/03/2026</w:t>
                             </w:r>
                             <w:r>
                               <w:rPr>
-                                <w:sz w:val="28"/>
-                                <w:szCs w:val="32"/>
+                                <w:sz w:val="26"/>
+                                <w:szCs w:val="30"/>
                               </w:rPr>
                               <w:fldChar w:fldCharType="end"/>
                             </w:r>
@@ -717,43 +717,43 @@
                     <w:p>
                       <w:pPr>
                         <w:rPr>
-                          <w:sz w:val="28"/>
-                          <w:szCs w:val="32"/>
+                          <w:sz w:val="26"/>
+                          <w:szCs w:val="30"/>
                         </w:rPr>
                       </w:pPr>
                       <w:r>
                         <w:rPr>
-                          <w:sz w:val="28"/>
-                          <w:szCs w:val="32"/>
+                          <w:sz w:val="26"/>
+                          <w:szCs w:val="30"/>
                         </w:rPr>
                         <w:fldChar w:fldCharType="begin"/>
                       </w:r>
                       <w:r>
                         <w:rPr>
-                          <w:sz w:val="28"/>
-                          <w:szCs w:val="32"/>
+                          <w:sz w:val="26"/>
+                          <w:szCs w:val="30"/>
                         </w:rPr>
                         <w:instrText xml:space="preserve"> DATE   \* MERGEFORMAT </w:instrText>
                       </w:r>
                       <w:r>
                         <w:rPr>
-                          <w:sz w:val="28"/>
-                          <w:szCs w:val="32"/>
+                          <w:sz w:val="26"/>
+                          <w:szCs w:val="30"/>
                         </w:rPr>
                         <w:fldChar w:fldCharType="separate"/>
                       </w:r>
                       <w:r>
                         <w:rPr>
                           <w:noProof/>
-                          <w:sz w:val="28"/>
-                          <w:szCs w:val="32"/>
+                          <w:sz w:val="26"/>
+                          <w:szCs w:val="30"/>
                         </w:rPr>
                         <w:t>18/03/2026</w:t>
                       </w:r>
                       <w:r>
                         <w:rPr>
-                          <w:sz w:val="28"/>
-                          <w:szCs w:val="32"/>
+                          <w:sz w:val="26"/>
+                          <w:szCs w:val="30"/>
                         </w:rPr>
                         <w:fldChar w:fldCharType="end"/>
                       </w:r>
@@ -904,20 +904,40 @@
                             <w:sdtContent>
                               <w:p>
                                 <w:r>
+                                  <w:rPr>
+                                    <w:sz w:val="26"/>
+                                    <w:szCs w:val="26"/>
+                                  </w:rPr>
                                   <w:t xml:space="preserve">DIAGNOSTICO </w:t>
                                 </w:r>
                                 <w:r>
+                                  <w:rPr>
+                                    <w:sz w:val="26"/>
+                                    <w:szCs w:val="26"/>
+                                  </w:rPr>
                                   <w:t xml:space="preserve">PRINCIPAL </w:t>
                                 </w:r>
                                 <w:r>
+                                  <w:rPr>
+                                    <w:sz w:val="26"/>
+                                    <w:szCs w:val="26"/>
+                                  </w:rPr>
                                   <w:t>(</w:t>
                                 </w:r>
                                 <w:proofErr w:type="spellStart"/>
                                 <w:r>
+                                  <w:rPr>
+                                    <w:sz w:val="26"/>
+                                    <w:szCs w:val="26"/>
+                                  </w:rPr>
                                   <w:t>EX</w:t>
                                 </w:r>
                                 <w:proofErr w:type="spellEnd"/>
                                 <w:r>
+                                  <w:rPr>
+                                    <w:sz w:val="26"/>
+                                    <w:szCs w:val="26"/>
+                                  </w:rPr>
                                   <w:t>: HERNIA DISCAL LOMBAR)</w:t>
                                 </w:r>
                               </w:p>

</xml_diff>

<commit_message>
fix: ajustes posição e fonte na APAC
- Caixa da data: 1pt para esquerda
- Data: 1pt para baixo
- Nome Dr. Eduardo: 1pt para baixo
- Nome do paciente: reduzir 1pt (sz=22, 11pt)

Co-Authored-By: Claude Opus 4.6 <noreply@anthropic.com>
</commit_message>
<xml_diff>
--- a/app/templates/TEMPLATE_APAC_ISOLADO.docx
+++ b/app/templates/TEMPLATE_APAC_ISOLADO.docx
@@ -195,14 +195,26 @@
                               <w:sdtEndPr/>
                               <w:sdtContent>
                                 <w:r>
+                                  <w:rPr>
+                                    <w:sz w:val="22"/>
+                                    <w:szCs w:val="22"/>
+                                  </w:rPr>
                                   <w:t>NOME DO PACIENTE (</w:t>
                                 </w:r>
                                 <w:proofErr w:type="spellStart"/>
                                 <w:r>
+                                  <w:rPr>
+                                    <w:sz w:val="22"/>
+                                    <w:szCs w:val="22"/>
+                                  </w:rPr>
                                   <w:t>EX</w:t>
                                 </w:r>
                                 <w:proofErr w:type="spellEnd"/>
                                 <w:r>
+                                  <w:rPr>
+                                    <w:sz w:val="22"/>
+                                    <w:szCs w:val="22"/>
+                                  </w:rPr>
                                   <w:t>: JOSÉ CARLOS)</w:t>
                                 </w:r>
                               </w:sdtContent>
@@ -615,10 +627,10 @@
               <wp:anchor distT="0" distB="0" distL="114300" distR="114300" simplePos="0" relativeHeight="251199488" behindDoc="0" locked="0" layoutInCell="1" allowOverlap="1" wp14:anchorId="58BC391C" wp14:editId="27300A10">
                 <wp:simplePos x="0" y="0"/>
                 <wp:positionH relativeFrom="column">
-                  <wp:posOffset>2946622</wp:posOffset>
+                  <wp:posOffset>2933922</wp:posOffset>
                 </wp:positionH>
                 <wp:positionV relativeFrom="paragraph">
-                  <wp:posOffset>7105015</wp:posOffset>
+                  <wp:posOffset>7117715</wp:posOffset>
                 </wp:positionV>
                 <wp:extent cx="1164590" cy="346710"/>
                 <wp:effectExtent l="0" t="0" r="0" b="0"/>
@@ -1293,7 +1305,7 @@
                   <wp:posOffset>4008120</wp:posOffset>
                 </wp:positionH>
                 <wp:positionV relativeFrom="paragraph">
-                  <wp:posOffset>7108825</wp:posOffset>
+                  <wp:posOffset>7121525</wp:posOffset>
                 </wp:positionV>
                 <wp:extent cx="2118360" cy="792480"/>
                 <wp:effectExtent l="0" t="0" r="0" b="0"/>

</xml_diff>